<commit_message>
feat: 16-item UX round — confirm-date popup, new file naming, form cleanup
- MY ผิดพิธีการ: popup confirming actual exit date before generating (editable, OK/Cancel)
- Download names: {yy.m.d from cutoff date}{TH|MY}_{plate}.docx e.g. 69.7.15TH_กจ123.docx
- Vehicle type is now a 2-option dropdown (รถยนต์/รถจักรยานยนต์); upload parser maps accordingly
- VIS: receipt date field after receipt number (feeds {{receipt_date_th}}), fine amount auto-formats with commas
- Actual-date field disabled/empty/gray for รถไทย + MY VIS (only MY.docx uses it)
- Labels shortened; tab names drop คำว่า ระบบ; เริ่มใหม่ button resets everything
- Custom car SVG tab icons + new site favicon (app/icon.svg)
- Templates fixed in public/: PTK removes space after ดปบ.ร., VIS attaches จำนวน{{fine_days_p2}} and uses receipt_date_th

Co-Authored-By: Claude Fable 5 <noreply@anthropic.com>
</commit_message>
<xml_diff>
--- a/public/PTK.docx
+++ b/public/PTK.docx
@@ -129,7 +129,7 @@
                                 <w:szCs w:val="36"/>
                                 <w:cs/>
                               </w:rPr>
-                              <w:t xml:space="preserve"> </w:t>
+                              <w:t xml:space="preserve"/>
                             </w:r>
                             <w:r>
                               <w:rPr>
@@ -254,7 +254,7 @@
                           <w:szCs w:val="36"/>
                           <w:cs/>
                         </w:rPr>
-                        <w:t xml:space="preserve"> </w:t>
+                        <w:t xml:space="preserve"/>
                       </w:r>
                       <w:r>
                         <w:rPr>

</xml_diff>